<commit_message>
Justificativa, Problemática e Hipótese
Others
</commit_message>
<xml_diff>
--- a/doc/Proposta.docx
+++ b/doc/Proposta.docx
@@ -17,7 +17,7 @@
           <w:lang w:val="pt-PT" w:eastAsia="pt-PT"/>
         </w:rPr>
         <w:drawing>
-          <wp:anchor distT="0" distB="0" distL="114300" distR="114300" simplePos="0" relativeHeight="251659264" behindDoc="0" locked="0" layoutInCell="1" allowOverlap="1" wp14:anchorId="4C8EFEEA" wp14:editId="3F25E125">
+          <wp:anchor distT="0" distB="0" distL="114300" distR="114300" simplePos="0" relativeHeight="251659264" behindDoc="0" locked="0" layoutInCell="1" allowOverlap="1" wp14:anchorId="4C8EFEEA" wp14:editId="5B14F356">
             <wp:simplePos x="0" y="0"/>
             <wp:positionH relativeFrom="margin">
               <wp:align>center</wp:align>
@@ -337,7 +337,7 @@
         </w:rPr>
         <w:lastRenderedPageBreak/>
         <w:drawing>
-          <wp:anchor distT="0" distB="0" distL="114300" distR="114300" simplePos="0" relativeHeight="251661312" behindDoc="0" locked="0" layoutInCell="1" allowOverlap="1" wp14:anchorId="00030A16" wp14:editId="213D139B">
+          <wp:anchor distT="0" distB="0" distL="114300" distR="114300" simplePos="0" relativeHeight="251661312" behindDoc="0" locked="0" layoutInCell="1" allowOverlap="1" wp14:anchorId="00030A16" wp14:editId="67C3BC20">
             <wp:simplePos x="0" y="0"/>
             <wp:positionH relativeFrom="margin">
               <wp:align>center</wp:align>
@@ -1386,8 +1386,54 @@
       <w:pPr>
         <w:rPr>
           <w:rFonts w:ascii="Times New Roman" w:hAnsi="Times New Roman" w:cs="Times New Roman"/>
-        </w:rPr>
-      </w:pPr>
+          <w:b/>
+          <w:bCs/>
+          <w:sz w:val="36"/>
+          <w:szCs w:val="36"/>
+        </w:rPr>
+      </w:pPr>
+      <w:r>
+        <w:rPr>
+          <w:rFonts w:ascii="Times New Roman" w:hAnsi="Times New Roman" w:cs="Times New Roman"/>
+          <w:b/>
+          <w:bCs/>
+          <w:sz w:val="32"/>
+          <w:szCs w:val="32"/>
+        </w:rPr>
+        <w:t>HIPÓTESE</w:t>
+      </w:r>
+    </w:p>
+    <w:p>
+      <w:pPr>
+        <w:rPr>
+          <w:rFonts w:ascii="Times New Roman" w:hAnsi="Times New Roman" w:cs="Times New Roman"/>
+          <w:b/>
+          <w:bCs/>
+          <w:sz w:val="36"/>
+          <w:szCs w:val="36"/>
+        </w:rPr>
+      </w:pPr>
+    </w:p>
+    <w:p>
+      <w:pPr>
+        <w:rPr>
+          <w:rFonts w:ascii="Times New Roman" w:hAnsi="Times New Roman" w:cs="Times New Roman"/>
+          <w:b/>
+          <w:bCs/>
+          <w:sz w:val="32"/>
+          <w:szCs w:val="32"/>
+        </w:rPr>
+      </w:pPr>
+      <w:r>
+        <w:rPr>
+          <w:rFonts w:ascii="Times New Roman" w:hAnsi="Times New Roman" w:cs="Times New Roman"/>
+          <w:b/>
+          <w:bCs/>
+          <w:sz w:val="32"/>
+          <w:szCs w:val="32"/>
+        </w:rPr>
+        <w:t>DELIMITAÇÃO</w:t>
+      </w:r>
     </w:p>
     <w:sectPr>
       <w:pgSz w:w="11906" w:h="16838"/>

</xml_diff>

<commit_message>
Finalização da Proposta do Tema.
Espaço entre linhas, Margens, Número de páginas... Só falta a delimitação😅
</commit_message>
<xml_diff>
--- a/doc/Proposta.docx
+++ b/doc/Proposta.docx
@@ -17,13 +17,13 @@
           <w:lang w:val="pt-PT" w:eastAsia="pt-PT"/>
         </w:rPr>
         <w:drawing>
-          <wp:anchor distT="0" distB="0" distL="114300" distR="114300" simplePos="0" relativeHeight="251659264" behindDoc="0" locked="0" layoutInCell="1" allowOverlap="1" wp14:anchorId="4C8EFEEA" wp14:editId="5B14F356">
+          <wp:anchor distT="0" distB="0" distL="114300" distR="114300" simplePos="0" relativeHeight="251659264" behindDoc="0" locked="0" layoutInCell="1" allowOverlap="1" wp14:anchorId="4C8EFEEA" wp14:editId="62F22B5D">
             <wp:simplePos x="0" y="0"/>
             <wp:positionH relativeFrom="margin">
               <wp:align>center</wp:align>
             </wp:positionH>
             <wp:positionV relativeFrom="paragraph">
-              <wp:posOffset>-785495</wp:posOffset>
+              <wp:posOffset>-394970</wp:posOffset>
             </wp:positionV>
             <wp:extent cx="1243965" cy="1076325"/>
             <wp:effectExtent l="0" t="0" r="0" b="9525"/>
@@ -85,6 +85,16 @@
         <w:jc w:val="center"/>
         <w:rPr>
           <w:rFonts w:ascii="Times New Roman" w:hAnsi="Times New Roman" w:cs="Times New Roman"/>
+          <w:sz w:val="32"/>
+          <w:szCs w:val="32"/>
+        </w:rPr>
+      </w:pPr>
+    </w:p>
+    <w:p>
+      <w:pPr>
+        <w:jc w:val="center"/>
+        <w:rPr>
+          <w:rFonts w:ascii="Times New Roman" w:hAnsi="Times New Roman" w:cs="Times New Roman"/>
           <w:sz w:val="36"/>
           <w:szCs w:val="36"/>
         </w:rPr>
@@ -296,6 +306,13 @@
     </w:p>
     <w:p>
       <w:pPr>
+        <w:rPr>
+          <w:rFonts w:ascii="Times New Roman" w:hAnsi="Times New Roman" w:cs="Times New Roman"/>
+        </w:rPr>
+      </w:pPr>
+    </w:p>
+    <w:p>
+      <w:pPr>
         <w:jc w:val="center"/>
         <w:rPr>
           <w:rFonts w:ascii="Times New Roman" w:hAnsi="Times New Roman" w:cs="Times New Roman"/>
@@ -326,6 +343,7 @@
     </w:p>
     <w:p>
       <w:pPr>
+        <w:jc w:val="center"/>
         <w:rPr>
           <w:rFonts w:ascii="Times New Roman" w:hAnsi="Times New Roman" w:cs="Times New Roman"/>
         </w:rPr>
@@ -337,13 +355,13 @@
         </w:rPr>
         <w:lastRenderedPageBreak/>
         <w:drawing>
-          <wp:anchor distT="0" distB="0" distL="114300" distR="114300" simplePos="0" relativeHeight="251661312" behindDoc="0" locked="0" layoutInCell="1" allowOverlap="1" wp14:anchorId="00030A16" wp14:editId="67C3BC20">
+          <wp:anchor distT="0" distB="0" distL="114300" distR="114300" simplePos="0" relativeHeight="251661312" behindDoc="0" locked="0" layoutInCell="1" allowOverlap="1" wp14:anchorId="00030A16" wp14:editId="51C73968">
             <wp:simplePos x="0" y="0"/>
             <wp:positionH relativeFrom="margin">
               <wp:align>center</wp:align>
             </wp:positionH>
             <wp:positionV relativeFrom="paragraph">
-              <wp:posOffset>-785495</wp:posOffset>
+              <wp:posOffset>-360045</wp:posOffset>
             </wp:positionV>
             <wp:extent cx="1243965" cy="1038225"/>
             <wp:effectExtent l="0" t="0" r="0" b="9525"/>
@@ -405,6 +423,16 @@
         <w:jc w:val="center"/>
         <w:rPr>
           <w:rFonts w:ascii="Times New Roman" w:hAnsi="Times New Roman" w:cs="Times New Roman"/>
+          <w:sz w:val="32"/>
+          <w:szCs w:val="32"/>
+        </w:rPr>
+      </w:pPr>
+    </w:p>
+    <w:p>
+      <w:pPr>
+        <w:jc w:val="center"/>
+        <w:rPr>
+          <w:rFonts w:ascii="Times New Roman" w:hAnsi="Times New Roman" w:cs="Times New Roman"/>
           <w:sz w:val="36"/>
           <w:szCs w:val="36"/>
         </w:rPr>
@@ -466,43 +494,52 @@
     </w:p>
     <w:p>
       <w:pPr>
+        <w:jc w:val="center"/>
+        <w:rPr>
+          <w:rFonts w:ascii="Times New Roman" w:hAnsi="Times New Roman" w:cs="Times New Roman"/>
+          <w:sz w:val="2"/>
+          <w:szCs w:val="2"/>
+        </w:rPr>
+      </w:pPr>
+    </w:p>
+    <w:p>
+      <w:pPr>
+        <w:jc w:val="center"/>
         <w:rPr>
           <w:rFonts w:ascii="Times New Roman" w:hAnsi="Times New Roman" w:cs="Times New Roman"/>
           <w:sz w:val="36"/>
           <w:szCs w:val="36"/>
         </w:rPr>
       </w:pPr>
-    </w:p>
-    <w:p>
-      <w:pPr>
+      <w:r>
         <w:rPr>
           <w:rFonts w:ascii="Times New Roman" w:hAnsi="Times New Roman" w:cs="Times New Roman"/>
           <w:sz w:val="36"/>
           <w:szCs w:val="36"/>
         </w:rPr>
-      </w:pPr>
-    </w:p>
-    <w:p>
-      <w:pPr>
+        <w:t>Tema:</w:t>
+      </w:r>
+    </w:p>
+    <w:p>
+      <w:pPr>
+        <w:jc w:val="center"/>
         <w:rPr>
           <w:rFonts w:ascii="Times New Roman" w:hAnsi="Times New Roman" w:cs="Times New Roman"/>
           <w:sz w:val="36"/>
           <w:szCs w:val="36"/>
         </w:rPr>
       </w:pPr>
-    </w:p>
-    <w:p>
-      <w:pPr>
+      <w:r>
         <w:rPr>
           <w:rFonts w:ascii="Times New Roman" w:hAnsi="Times New Roman" w:cs="Times New Roman"/>
           <w:sz w:val="36"/>
           <w:szCs w:val="36"/>
         </w:rPr>
-      </w:pPr>
-    </w:p>
-    <w:p>
-      <w:pPr>
-        <w:jc w:val="center"/>
+        <w:t>Desenvolvimento de um Sistema de Semáforo Inteligente Adaptativo com Monitorização Web para a Gestão de Tráfego Urbano</w:t>
+      </w:r>
+    </w:p>
+    <w:p>
+      <w:pPr>
         <w:rPr>
           <w:rFonts w:ascii="Times New Roman" w:hAnsi="Times New Roman" w:cs="Times New Roman"/>
           <w:sz w:val="36"/>
@@ -512,6 +549,16 @@
     </w:p>
     <w:p>
       <w:pPr>
+        <w:jc w:val="center"/>
+        <w:rPr>
+          <w:rFonts w:ascii="Times New Roman" w:hAnsi="Times New Roman" w:cs="Times New Roman"/>
+          <w:sz w:val="36"/>
+          <w:szCs w:val="36"/>
+        </w:rPr>
+      </w:pPr>
+    </w:p>
+    <w:p>
+      <w:pPr>
         <w:rPr>
           <w:rFonts w:ascii="Times New Roman" w:hAnsi="Times New Roman" w:cs="Times New Roman"/>
           <w:b/>
@@ -550,7 +597,19 @@
         <w:rPr>
           <w:rFonts w:ascii="Times New Roman" w:hAnsi="Times New Roman" w:cs="Times New Roman"/>
         </w:rPr>
-        <w:t>Lisandra</w:t>
+        <w:t xml:space="preserve">Lisandra Maria </w:t>
+      </w:r>
+      <w:r>
+        <w:rPr>
+          <w:rFonts w:ascii="Times New Roman" w:hAnsi="Times New Roman" w:cs="Times New Roman"/>
+        </w:rPr>
+        <w:t>d</w:t>
+      </w:r>
+      <w:r>
+        <w:rPr>
+          <w:rFonts w:ascii="Times New Roman" w:hAnsi="Times New Roman" w:cs="Times New Roman"/>
+        </w:rPr>
+        <w:t>e Almeida Gonçalves</w:t>
       </w:r>
     </w:p>
     <w:p>
@@ -581,59 +640,176 @@
     </w:p>
     <w:p>
       <w:pPr>
-        <w:jc w:val="center"/>
-        <w:rPr>
-          <w:rFonts w:ascii="Times New Roman" w:hAnsi="Times New Roman" w:cs="Times New Roman"/>
-        </w:rPr>
-      </w:pPr>
-    </w:p>
-    <w:p>
-      <w:pPr>
-        <w:jc w:val="center"/>
-        <w:rPr>
-          <w:rFonts w:ascii="Times New Roman" w:hAnsi="Times New Roman" w:cs="Times New Roman"/>
-        </w:rPr>
-      </w:pPr>
-    </w:p>
-    <w:p>
-      <w:pPr>
-        <w:jc w:val="center"/>
-        <w:rPr>
-          <w:rFonts w:ascii="Times New Roman" w:hAnsi="Times New Roman" w:cs="Times New Roman"/>
-        </w:rPr>
-      </w:pPr>
-    </w:p>
-    <w:p>
-      <w:pPr>
-        <w:jc w:val="center"/>
-        <w:rPr>
-          <w:rFonts w:ascii="Times New Roman" w:hAnsi="Times New Roman" w:cs="Times New Roman"/>
-        </w:rPr>
-      </w:pPr>
-    </w:p>
-    <w:p>
-      <w:pPr>
-        <w:jc w:val="center"/>
-        <w:rPr>
-          <w:rFonts w:ascii="Times New Roman" w:hAnsi="Times New Roman" w:cs="Times New Roman"/>
-        </w:rPr>
-      </w:pPr>
-    </w:p>
-    <w:p>
-      <w:pPr>
-        <w:jc w:val="center"/>
-        <w:rPr>
-          <w:rFonts w:ascii="Times New Roman" w:hAnsi="Times New Roman" w:cs="Times New Roman"/>
-        </w:rPr>
-      </w:pPr>
-    </w:p>
-    <w:p>
-      <w:pPr>
-        <w:jc w:val="center"/>
-        <w:rPr>
-          <w:rFonts w:ascii="Times New Roman" w:hAnsi="Times New Roman" w:cs="Times New Roman"/>
-        </w:rPr>
-      </w:pPr>
+        <w:rPr>
+          <w:rFonts w:ascii="Times New Roman" w:hAnsi="Times New Roman" w:cs="Times New Roman"/>
+        </w:rPr>
+      </w:pPr>
+    </w:p>
+    <w:p>
+      <w:pPr>
+        <w:rPr>
+          <w:rFonts w:ascii="Times New Roman" w:hAnsi="Times New Roman" w:cs="Times New Roman"/>
+        </w:rPr>
+      </w:pPr>
+    </w:p>
+    <w:p>
+      <w:pPr>
+        <w:rPr>
+          <w:rFonts w:ascii="Times New Roman" w:hAnsi="Times New Roman" w:cs="Times New Roman"/>
+        </w:rPr>
+      </w:pPr>
+    </w:p>
+    <w:p>
+      <w:pPr>
+        <w:ind w:left="3600"/>
+        <w:jc w:val="both"/>
+        <w:rPr>
+          <w:rFonts w:ascii="Times New Roman" w:hAnsi="Times New Roman" w:cs="Times New Roman"/>
+        </w:rPr>
+      </w:pPr>
+      <w:r>
+        <w:rPr>
+          <w:rFonts w:ascii="Times New Roman" w:hAnsi="Times New Roman" w:cs="Times New Roman"/>
+        </w:rPr>
+        <w:t>Proposta d</w:t>
+      </w:r>
+      <w:r>
+        <w:rPr>
+          <w:rFonts w:ascii="Times New Roman" w:hAnsi="Times New Roman" w:cs="Times New Roman"/>
+        </w:rPr>
+        <w:t>e</w:t>
+      </w:r>
+      <w:r>
+        <w:rPr>
+          <w:rFonts w:ascii="Times New Roman" w:hAnsi="Times New Roman" w:cs="Times New Roman"/>
+        </w:rPr>
+        <w:t xml:space="preserve"> tema para  f</w:t>
+      </w:r>
+      <w:r>
+        <w:rPr>
+          <w:rFonts w:ascii="Times New Roman" w:hAnsi="Times New Roman" w:cs="Times New Roman"/>
+        </w:rPr>
+        <w:t>im</w:t>
+      </w:r>
+      <w:r>
+        <w:rPr>
+          <w:rFonts w:ascii="Times New Roman" w:hAnsi="Times New Roman" w:cs="Times New Roman"/>
+        </w:rPr>
+        <w:t xml:space="preserve"> d</w:t>
+      </w:r>
+      <w:r>
+        <w:rPr>
+          <w:rFonts w:ascii="Times New Roman" w:hAnsi="Times New Roman" w:cs="Times New Roman"/>
+        </w:rPr>
+        <w:t>e</w:t>
+      </w:r>
+      <w:r>
+        <w:rPr>
+          <w:rFonts w:ascii="Times New Roman" w:hAnsi="Times New Roman" w:cs="Times New Roman"/>
+        </w:rPr>
+        <w:t xml:space="preserve"> curso apresentado ao </w:t>
+      </w:r>
+      <w:r>
+        <w:rPr>
+          <w:rFonts w:ascii="Times New Roman" w:hAnsi="Times New Roman" w:cs="Times New Roman"/>
+        </w:rPr>
+        <w:t>C</w:t>
+      </w:r>
+      <w:r>
+        <w:rPr>
+          <w:rFonts w:ascii="Times New Roman" w:hAnsi="Times New Roman" w:cs="Times New Roman"/>
+        </w:rPr>
+        <w:t xml:space="preserve">omplexo </w:t>
+      </w:r>
+      <w:r>
+        <w:rPr>
+          <w:rFonts w:ascii="Times New Roman" w:hAnsi="Times New Roman" w:cs="Times New Roman"/>
+        </w:rPr>
+        <w:t>E</w:t>
+      </w:r>
+      <w:r>
+        <w:rPr>
+          <w:rFonts w:ascii="Times New Roman" w:hAnsi="Times New Roman" w:cs="Times New Roman"/>
+        </w:rPr>
+        <w:t xml:space="preserve">scolar </w:t>
+      </w:r>
+      <w:r>
+        <w:rPr>
+          <w:rFonts w:ascii="Times New Roman" w:hAnsi="Times New Roman" w:cs="Times New Roman"/>
+        </w:rPr>
+        <w:t>L</w:t>
+      </w:r>
+      <w:r>
+        <w:rPr>
+          <w:rFonts w:ascii="Times New Roman" w:hAnsi="Times New Roman" w:cs="Times New Roman"/>
+        </w:rPr>
+        <w:t xml:space="preserve">oide </w:t>
+      </w:r>
+      <w:r>
+        <w:rPr>
+          <w:rFonts w:ascii="Times New Roman" w:hAnsi="Times New Roman" w:cs="Times New Roman"/>
+        </w:rPr>
+        <w:t>L</w:t>
+      </w:r>
+      <w:r>
+        <w:rPr>
+          <w:rFonts w:ascii="Times New Roman" w:hAnsi="Times New Roman" w:cs="Times New Roman"/>
+        </w:rPr>
+        <w:t>aura como pré-requisito obtenção do grau</w:t>
+      </w:r>
+      <w:r>
+        <w:rPr>
+          <w:rFonts w:ascii="Times New Roman" w:hAnsi="Times New Roman" w:cs="Times New Roman"/>
+        </w:rPr>
+        <w:t xml:space="preserve"> </w:t>
+      </w:r>
+      <w:r>
+        <w:rPr>
+          <w:rFonts w:ascii="Times New Roman" w:hAnsi="Times New Roman" w:cs="Times New Roman"/>
+        </w:rPr>
+        <w:t>de técnico médio e</w:t>
+      </w:r>
+      <w:r>
+        <w:rPr>
+          <w:rFonts w:ascii="Times New Roman" w:hAnsi="Times New Roman" w:cs="Times New Roman"/>
+        </w:rPr>
+        <w:t>m</w:t>
+      </w:r>
+      <w:r>
+        <w:rPr>
+          <w:rFonts w:ascii="Times New Roman" w:hAnsi="Times New Roman" w:cs="Times New Roman"/>
+        </w:rPr>
+        <w:t xml:space="preserve"> informática</w:t>
+      </w:r>
+      <w:r>
+        <w:rPr>
+          <w:rFonts w:ascii="Times New Roman" w:hAnsi="Times New Roman" w:cs="Times New Roman"/>
+        </w:rPr>
+        <w:t>.</w:t>
+      </w:r>
+    </w:p>
+    <w:p>
+      <w:pPr>
+        <w:ind w:left="3600"/>
+        <w:jc w:val="both"/>
+        <w:rPr>
+          <w:rFonts w:ascii="Times New Roman" w:hAnsi="Times New Roman" w:cs="Times New Roman"/>
+        </w:rPr>
+      </w:pPr>
+      <w:r>
+        <w:rPr>
+          <w:rFonts w:ascii="Times New Roman" w:hAnsi="Times New Roman" w:cs="Times New Roman"/>
+          <w:b/>
+          <w:bCs/>
+        </w:rPr>
+        <w:t>Orientadores</w:t>
+      </w:r>
+      <w:r>
+        <w:rPr>
+          <w:rFonts w:ascii="Times New Roman" w:hAnsi="Times New Roman" w:cs="Times New Roman"/>
+        </w:rPr>
+        <w:t>: Eurico Ângelo e Valter de Almeida</w:t>
+      </w:r>
     </w:p>
     <w:p>
       <w:pPr>
@@ -804,6 +980,12 @@
           <w:sz w:val="36"/>
           <w:szCs w:val="36"/>
         </w:rPr>
+        <w:sectPr>
+          <w:pgSz w:w="11906" w:h="16838"/>
+          <w:pgMar w:top="851" w:right="1134" w:bottom="851" w:left="1418" w:header="708" w:footer="708" w:gutter="0"/>
+          <w:cols w:space="708"/>
+          <w:docGrid w:linePitch="360"/>
+        </w:sectPr>
       </w:pPr>
       <w:r>
         <w:rPr>
@@ -826,9 +1008,7 @@
           <w:szCs w:val="32"/>
         </w:rPr>
       </w:pPr>
-    </w:p>
-    <w:p>
-      <w:pPr>
+      <w:r>
         <w:rPr>
           <w:rFonts w:ascii="Times New Roman" w:hAnsi="Times New Roman" w:cs="Times New Roman"/>
           <w:b/>
@@ -836,10 +1016,107 @@
           <w:sz w:val="32"/>
           <w:szCs w:val="32"/>
         </w:rPr>
-      </w:pPr>
-    </w:p>
-    <w:p>
-      <w:pPr>
+        <w:lastRenderedPageBreak/>
+        <w:t>INTRODUÇÃO</w:t>
+      </w:r>
+    </w:p>
+    <w:p>
+      <w:pPr>
+        <w:spacing w:line="360" w:lineRule="auto"/>
+        <w:jc w:val="both"/>
+        <w:rPr>
+          <w:rFonts w:ascii="Times New Roman" w:hAnsi="Times New Roman" w:cs="Times New Roman"/>
+        </w:rPr>
+      </w:pPr>
+      <w:r>
+        <w:rPr>
+          <w:rFonts w:ascii="Times New Roman" w:hAnsi="Times New Roman" w:cs="Times New Roman"/>
+        </w:rPr>
+        <w:t xml:space="preserve">O crescimento do parque </w:t>
+      </w:r>
+      <w:r>
+        <w:rPr>
+          <w:rFonts w:ascii="Times New Roman" w:hAnsi="Times New Roman" w:cs="Times New Roman"/>
+        </w:rPr>
+        <w:t xml:space="preserve">de </w:t>
+      </w:r>
+      <w:r>
+        <w:rPr>
+          <w:rFonts w:ascii="Times New Roman" w:hAnsi="Times New Roman" w:cs="Times New Roman"/>
+        </w:rPr>
+        <w:t>automóvel nas grandes cidades aumenta o congestionamento nas horas de ponta, o consumo de combustível e o tempo perdido pelos cidadãos nas deslocações diárias. A maioria dos semáforos em funcionamento utiliza ciclos de tempo fixos, que não respondem às variações reais do tráfego ao longo do dia.</w:t>
+      </w:r>
+    </w:p>
+    <w:p>
+      <w:pPr>
+        <w:spacing w:line="360" w:lineRule="auto"/>
+        <w:jc w:val="both"/>
+        <w:rPr>
+          <w:rFonts w:ascii="Times New Roman" w:hAnsi="Times New Roman" w:cs="Times New Roman"/>
+        </w:rPr>
+      </w:pPr>
+    </w:p>
+    <w:p>
+      <w:pPr>
+        <w:spacing w:line="360" w:lineRule="auto"/>
+        <w:jc w:val="both"/>
+        <w:rPr>
+          <w:rFonts w:ascii="Times New Roman" w:hAnsi="Times New Roman" w:cs="Times New Roman"/>
+        </w:rPr>
+      </w:pPr>
+      <w:r>
+        <w:rPr>
+          <w:rFonts w:ascii="Times New Roman" w:hAnsi="Times New Roman" w:cs="Times New Roman"/>
+        </w:rPr>
+        <w:t>Os sistemas de controlo semafórico adaptativo, como o SCOOT e o SCATS, resolvem parte deste problema, mas exigem infra-estruturas dispendiosas e complexas. Existe, por isso, espaço para soluções de baixo custo, baseadas em microcontroladores e Internet das Coisas (IoT), adequadas a realidades como a de Luanda, onde o trânsito é intenso e a energia eléctrica nem sempre é estável.</w:t>
+      </w:r>
+    </w:p>
+    <w:p>
+      <w:pPr>
+        <w:spacing w:line="360" w:lineRule="auto"/>
+        <w:jc w:val="both"/>
+        <w:rPr>
+          <w:rFonts w:ascii="Times New Roman" w:hAnsi="Times New Roman" w:cs="Times New Roman"/>
+        </w:rPr>
+      </w:pPr>
+    </w:p>
+    <w:p>
+      <w:pPr>
+        <w:spacing w:line="360" w:lineRule="auto"/>
+        <w:jc w:val="both"/>
+        <w:rPr>
+          <w:rFonts w:ascii="Times New Roman" w:hAnsi="Times New Roman" w:cs="Times New Roman"/>
+        </w:rPr>
+      </w:pPr>
+      <w:r>
+        <w:rPr>
+          <w:rFonts w:ascii="Times New Roman" w:hAnsi="Times New Roman" w:cs="Times New Roman"/>
+        </w:rPr>
+        <w:t>A presente proposta descreve o desenvolvimento de um protótipo de semáforo inteligente que ajusta o tempo de verde em função da densidade de veículos, acompanhado de um painel web de monitorização e de dados históricos.</w:t>
+      </w:r>
+    </w:p>
+    <w:p>
+      <w:pPr>
+        <w:jc w:val="both"/>
+        <w:rPr>
+          <w:rFonts w:ascii="Times New Roman" w:hAnsi="Times New Roman" w:cs="Times New Roman"/>
+        </w:rPr>
+      </w:pPr>
+    </w:p>
+    <w:p>
+      <w:pPr>
+        <w:spacing w:line="360" w:lineRule="auto"/>
+        <w:rPr>
+          <w:rFonts w:ascii="Times New Roman" w:hAnsi="Times New Roman" w:cs="Times New Roman"/>
+        </w:rPr>
+      </w:pPr>
+      <w:r>
+        <w:rPr>
+          <w:rFonts w:ascii="Times New Roman" w:hAnsi="Times New Roman" w:cs="Times New Roman"/>
+        </w:rPr>
+        <w:br w:type="page"/>
+      </w:r>
+      <w:r>
         <w:rPr>
           <w:rFonts w:ascii="Times New Roman" w:hAnsi="Times New Roman" w:cs="Times New Roman"/>
           <w:b/>
@@ -847,10 +1124,191 @@
           <w:sz w:val="32"/>
           <w:szCs w:val="32"/>
         </w:rPr>
-      </w:pPr>
-    </w:p>
-    <w:p>
-      <w:pPr>
+        <w:lastRenderedPageBreak/>
+        <w:t>JUSTIFICATIVA</w:t>
+      </w:r>
+    </w:p>
+    <w:p>
+      <w:pPr>
+        <w:spacing w:line="360" w:lineRule="auto"/>
+        <w:jc w:val="both"/>
+        <w:rPr>
+          <w:rFonts w:ascii="Times New Roman" w:hAnsi="Times New Roman" w:cs="Times New Roman"/>
+        </w:rPr>
+      </w:pPr>
+      <w:r>
+        <w:rPr>
+          <w:rFonts w:ascii="Times New Roman" w:hAnsi="Times New Roman" w:cs="Times New Roman"/>
+        </w:rPr>
+        <w:t>O crescimento populacional e a expansão urbana têm provocado um aumento significativo no</w:t>
+      </w:r>
+      <w:r>
+        <w:rPr>
+          <w:rFonts w:ascii="Times New Roman" w:hAnsi="Times New Roman" w:cs="Times New Roman"/>
+        </w:rPr>
+        <w:t xml:space="preserve"> </w:t>
+      </w:r>
+      <w:r>
+        <w:rPr>
+          <w:rFonts w:ascii="Times New Roman" w:hAnsi="Times New Roman" w:cs="Times New Roman"/>
+        </w:rPr>
+        <w:t>fluxo de veículos nas cidades, resultando em congestionamentos, longos tempos de espera,</w:t>
+      </w:r>
+      <w:r>
+        <w:rPr>
+          <w:rFonts w:ascii="Times New Roman" w:hAnsi="Times New Roman" w:cs="Times New Roman"/>
+        </w:rPr>
+        <w:t xml:space="preserve"> </w:t>
+      </w:r>
+      <w:r>
+        <w:rPr>
+          <w:rFonts w:ascii="Times New Roman" w:hAnsi="Times New Roman" w:cs="Times New Roman"/>
+        </w:rPr>
+        <w:t>consumo excessivo de combustível e maior emissão de poluentes. Em muitos locais, os</w:t>
+      </w:r>
+      <w:r>
+        <w:rPr>
+          <w:rFonts w:ascii="Times New Roman" w:hAnsi="Times New Roman" w:cs="Times New Roman"/>
+        </w:rPr>
+        <w:t xml:space="preserve"> </w:t>
+      </w:r>
+      <w:r>
+        <w:rPr>
+          <w:rFonts w:ascii="Times New Roman" w:hAnsi="Times New Roman" w:cs="Times New Roman"/>
+        </w:rPr>
+        <w:t>semáforos ainda funcionam com temporizações fixas, que não consideram as variações do</w:t>
+      </w:r>
+      <w:r>
+        <w:rPr>
+          <w:rFonts w:ascii="Times New Roman" w:hAnsi="Times New Roman" w:cs="Times New Roman"/>
+        </w:rPr>
+        <w:t xml:space="preserve"> </w:t>
+      </w:r>
+      <w:r>
+        <w:rPr>
+          <w:rFonts w:ascii="Times New Roman" w:hAnsi="Times New Roman" w:cs="Times New Roman"/>
+        </w:rPr>
+        <w:t>tráfego ao longo do dia. Como consequência, podem ocorrer situações em que uma via</w:t>
+      </w:r>
+      <w:r>
+        <w:rPr>
+          <w:rFonts w:ascii="Times New Roman" w:hAnsi="Times New Roman" w:cs="Times New Roman"/>
+        </w:rPr>
+        <w:t xml:space="preserve"> </w:t>
+      </w:r>
+      <w:r>
+        <w:rPr>
+          <w:rFonts w:ascii="Times New Roman" w:hAnsi="Times New Roman" w:cs="Times New Roman"/>
+        </w:rPr>
+        <w:t>permanece livre enquanto outra apresenta uma grande concentração de veículos, reduzindo a</w:t>
+      </w:r>
+      <w:r>
+        <w:rPr>
+          <w:rFonts w:ascii="Times New Roman" w:hAnsi="Times New Roman" w:cs="Times New Roman"/>
+        </w:rPr>
+        <w:t xml:space="preserve"> </w:t>
+      </w:r>
+      <w:r>
+        <w:rPr>
+          <w:rFonts w:ascii="Times New Roman" w:hAnsi="Times New Roman" w:cs="Times New Roman"/>
+        </w:rPr>
+        <w:t>eficiência da circulação urbana.</w:t>
+      </w:r>
+    </w:p>
+    <w:p>
+      <w:pPr>
+        <w:spacing w:line="360" w:lineRule="auto"/>
+        <w:jc w:val="both"/>
+        <w:rPr>
+          <w:rFonts w:ascii="Times New Roman" w:hAnsi="Times New Roman" w:cs="Times New Roman"/>
+        </w:rPr>
+      </w:pPr>
+    </w:p>
+    <w:p>
+      <w:pPr>
+        <w:spacing w:line="360" w:lineRule="auto"/>
+        <w:jc w:val="both"/>
+        <w:rPr>
+          <w:rFonts w:ascii="Times New Roman" w:hAnsi="Times New Roman" w:cs="Times New Roman"/>
+        </w:rPr>
+      </w:pPr>
+      <w:r>
+        <w:rPr>
+          <w:rFonts w:ascii="Times New Roman" w:hAnsi="Times New Roman" w:cs="Times New Roman"/>
+        </w:rPr>
+        <w:t>A escolha deste tema nasce das seguintes razões:</w:t>
+      </w:r>
+    </w:p>
+    <w:p>
+      <w:pPr>
+        <w:numPr>
+          <w:ilvl w:val="0"/>
+          <w:numId w:val="1"/>
+        </w:numPr>
+        <w:spacing w:line="360" w:lineRule="auto"/>
+        <w:jc w:val="both"/>
+        <w:rPr>
+          <w:rFonts w:ascii="Times New Roman" w:hAnsi="Times New Roman" w:cs="Times New Roman"/>
+        </w:rPr>
+      </w:pPr>
+      <w:r>
+        <w:rPr>
+          <w:rFonts w:ascii="Times New Roman" w:hAnsi="Times New Roman" w:cs="Times New Roman"/>
+        </w:rPr>
+        <w:t>Reduzir o tempo de espera e o congestionamento nos cruzamentos.</w:t>
+      </w:r>
+    </w:p>
+    <w:p>
+      <w:pPr>
+        <w:numPr>
+          <w:ilvl w:val="0"/>
+          <w:numId w:val="1"/>
+        </w:numPr>
+        <w:spacing w:line="360" w:lineRule="auto"/>
+        <w:jc w:val="both"/>
+        <w:rPr>
+          <w:rFonts w:ascii="Times New Roman" w:hAnsi="Times New Roman" w:cs="Times New Roman"/>
+        </w:rPr>
+      </w:pPr>
+      <w:r>
+        <w:rPr>
+          <w:rFonts w:ascii="Times New Roman" w:hAnsi="Times New Roman" w:cs="Times New Roman"/>
+        </w:rPr>
+        <w:t>Demonstrar uma solução de baixo custo, escalável e adaptada ao contexto local.</w:t>
+      </w:r>
+    </w:p>
+    <w:p>
+      <w:pPr>
+        <w:numPr>
+          <w:ilvl w:val="0"/>
+          <w:numId w:val="1"/>
+        </w:numPr>
+        <w:spacing w:line="360" w:lineRule="auto"/>
+        <w:jc w:val="both"/>
+        <w:rPr>
+          <w:rFonts w:ascii="Times New Roman" w:hAnsi="Times New Roman" w:cs="Times New Roman"/>
+        </w:rPr>
+      </w:pPr>
+      <w:r>
+        <w:rPr>
+          <w:rFonts w:ascii="Times New Roman" w:hAnsi="Times New Roman" w:cs="Times New Roman"/>
+        </w:rPr>
+        <w:t>Gerar dados que possam apoiar o planeamento urbano e a tomada de decisão.</w:t>
+      </w:r>
+    </w:p>
+    <w:p>
+      <w:pPr>
+        <w:spacing w:line="360" w:lineRule="auto"/>
+        <w:jc w:val="both"/>
+        <w:rPr>
+          <w:rFonts w:ascii="Times New Roman" w:hAnsi="Times New Roman" w:cs="Times New Roman"/>
+        </w:rPr>
+      </w:pPr>
+    </w:p>
+    <w:p>
+      <w:pPr>
+        <w:spacing w:line="360" w:lineRule="auto"/>
+        <w:jc w:val="both"/>
         <w:rPr>
           <w:rFonts w:ascii="Times New Roman" w:hAnsi="Times New Roman" w:cs="Times New Roman"/>
           <w:b/>
@@ -859,9 +1317,7 @@
           <w:szCs w:val="32"/>
         </w:rPr>
       </w:pPr>
-    </w:p>
-    <w:p>
-      <w:pPr>
+      <w:r>
         <w:rPr>
           <w:rFonts w:ascii="Times New Roman" w:hAnsi="Times New Roman" w:cs="Times New Roman"/>
           <w:b/>
@@ -869,10 +1325,204 @@
           <w:sz w:val="32"/>
           <w:szCs w:val="32"/>
         </w:rPr>
-      </w:pPr>
-    </w:p>
-    <w:p>
-      <w:pPr>
+        <w:t>PROBLEMÁTICA</w:t>
+      </w:r>
+    </w:p>
+    <w:p>
+      <w:pPr>
+        <w:spacing w:line="360" w:lineRule="auto"/>
+        <w:jc w:val="both"/>
+        <w:rPr>
+          <w:rFonts w:ascii="Times New Roman" w:hAnsi="Times New Roman" w:cs="Times New Roman"/>
+        </w:rPr>
+      </w:pPr>
+      <w:r>
+        <w:rPr>
+          <w:rFonts w:ascii="Times New Roman" w:hAnsi="Times New Roman" w:cs="Times New Roman"/>
+        </w:rPr>
+        <w:t>O problema desta investigação está relacionado com a utilização de sistemas semafóricos de</w:t>
+      </w:r>
+      <w:r>
+        <w:rPr>
+          <w:rFonts w:ascii="Times New Roman" w:hAnsi="Times New Roman" w:cs="Times New Roman"/>
+        </w:rPr>
+        <w:t xml:space="preserve"> </w:t>
+      </w:r>
+      <w:r>
+        <w:rPr>
+          <w:rFonts w:ascii="Times New Roman" w:hAnsi="Times New Roman" w:cs="Times New Roman"/>
+        </w:rPr>
+        <w:t>temporização fixa, que não conseguem responder adequadamente às variações do fluxo de</w:t>
+      </w:r>
+      <w:r>
+        <w:rPr>
+          <w:rFonts w:ascii="Times New Roman" w:hAnsi="Times New Roman" w:cs="Times New Roman"/>
+        </w:rPr>
+        <w:t xml:space="preserve"> </w:t>
+      </w:r>
+      <w:r>
+        <w:rPr>
+          <w:rFonts w:ascii="Times New Roman" w:hAnsi="Times New Roman" w:cs="Times New Roman"/>
+        </w:rPr>
+        <w:t>veículos nas vias urbanas. Essa limitação contribui para a formação de congestionamentos, o</w:t>
+      </w:r>
+      <w:r>
+        <w:rPr>
+          <w:rFonts w:ascii="Times New Roman" w:hAnsi="Times New Roman" w:cs="Times New Roman"/>
+        </w:rPr>
+        <w:t xml:space="preserve"> </w:t>
+      </w:r>
+      <w:r>
+        <w:rPr>
+          <w:rFonts w:ascii="Times New Roman" w:hAnsi="Times New Roman" w:cs="Times New Roman"/>
+        </w:rPr>
+        <w:t>aumento do tempo de espera, o desperdício de combustível e a redução da eficiência da</w:t>
+      </w:r>
+      <w:r>
+        <w:rPr>
+          <w:rFonts w:ascii="Times New Roman" w:hAnsi="Times New Roman" w:cs="Times New Roman"/>
+        </w:rPr>
+        <w:t xml:space="preserve"> </w:t>
+      </w:r>
+      <w:r>
+        <w:rPr>
+          <w:rFonts w:ascii="Times New Roman" w:hAnsi="Times New Roman" w:cs="Times New Roman"/>
+        </w:rPr>
+        <w:t>circulação, especialmente nos horários de maior movimento ou em situações atípicas, como</w:t>
+      </w:r>
+      <w:r>
+        <w:rPr>
+          <w:rFonts w:ascii="Times New Roman" w:hAnsi="Times New Roman" w:cs="Times New Roman"/>
+        </w:rPr>
+        <w:t xml:space="preserve"> </w:t>
+      </w:r>
+      <w:r>
+        <w:rPr>
+          <w:rFonts w:ascii="Times New Roman" w:hAnsi="Times New Roman" w:cs="Times New Roman"/>
+        </w:rPr>
+        <w:t>acidentes, obras e eventos.</w:t>
+      </w:r>
+    </w:p>
+    <w:p>
+      <w:pPr>
+        <w:spacing w:line="360" w:lineRule="auto"/>
+        <w:jc w:val="both"/>
+        <w:rPr>
+          <w:rFonts w:ascii="Times New Roman" w:hAnsi="Times New Roman" w:cs="Times New Roman"/>
+        </w:rPr>
+      </w:pPr>
+    </w:p>
+    <w:p>
+      <w:pPr>
+        <w:spacing w:line="360" w:lineRule="auto"/>
+        <w:jc w:val="both"/>
+        <w:rPr>
+          <w:rFonts w:ascii="Times New Roman" w:hAnsi="Times New Roman" w:cs="Times New Roman"/>
+        </w:rPr>
+      </w:pPr>
+      <w:r>
+        <w:rPr>
+          <w:rFonts w:ascii="Times New Roman" w:hAnsi="Times New Roman" w:cs="Times New Roman"/>
+        </w:rPr>
+        <w:t>Embora os sistemas semafóricos adaptativos permitam ajustar os tempos de sinalização com</w:t>
+      </w:r>
+      <w:r>
+        <w:rPr>
+          <w:rFonts w:ascii="Times New Roman" w:hAnsi="Times New Roman" w:cs="Times New Roman"/>
+        </w:rPr>
+        <w:t xml:space="preserve"> </w:t>
+      </w:r>
+      <w:r>
+        <w:rPr>
+          <w:rFonts w:ascii="Times New Roman" w:hAnsi="Times New Roman" w:cs="Times New Roman"/>
+        </w:rPr>
+        <w:t>base nas condições reais do tráfego, ainda existe a necessidade de integrar essa funcionalidade</w:t>
+      </w:r>
+      <w:r>
+        <w:rPr>
+          <w:rFonts w:ascii="Times New Roman" w:hAnsi="Times New Roman" w:cs="Times New Roman"/>
+        </w:rPr>
+        <w:t xml:space="preserve"> </w:t>
+      </w:r>
+      <w:r>
+        <w:rPr>
+          <w:rFonts w:ascii="Times New Roman" w:hAnsi="Times New Roman" w:cs="Times New Roman"/>
+        </w:rPr>
+        <w:t>a uma plataforma web que possibilite a monitorização remota e em tempo real do estado dos</w:t>
+      </w:r>
+      <w:r>
+        <w:rPr>
+          <w:rFonts w:ascii="Times New Roman" w:hAnsi="Times New Roman" w:cs="Times New Roman"/>
+        </w:rPr>
+        <w:t xml:space="preserve"> </w:t>
+      </w:r>
+      <w:r>
+        <w:rPr>
+          <w:rFonts w:ascii="Times New Roman" w:hAnsi="Times New Roman" w:cs="Times New Roman"/>
+        </w:rPr>
+        <w:t>semáforos e das condições de circulação. A ausência dessa integração dificulta o</w:t>
+      </w:r>
+      <w:r>
+        <w:rPr>
+          <w:rFonts w:ascii="Times New Roman" w:hAnsi="Times New Roman" w:cs="Times New Roman"/>
+        </w:rPr>
+        <w:t xml:space="preserve"> </w:t>
+      </w:r>
+      <w:r>
+        <w:rPr>
+          <w:rFonts w:ascii="Times New Roman" w:hAnsi="Times New Roman" w:cs="Times New Roman"/>
+        </w:rPr>
+        <w:t>acompanhamento do sistema, a análise dos dados e a intervenção dos responsáveis pela gestão</w:t>
+      </w:r>
+      <w:r>
+        <w:rPr>
+          <w:rFonts w:ascii="Times New Roman" w:hAnsi="Times New Roman" w:cs="Times New Roman"/>
+        </w:rPr>
+        <w:t xml:space="preserve"> </w:t>
+      </w:r>
+      <w:r>
+        <w:rPr>
+          <w:rFonts w:ascii="Times New Roman" w:hAnsi="Times New Roman" w:cs="Times New Roman"/>
+        </w:rPr>
+        <w:t>do tráfego.</w:t>
+      </w:r>
+    </w:p>
+    <w:p>
+      <w:pPr>
+        <w:spacing w:line="360" w:lineRule="auto"/>
+        <w:jc w:val="both"/>
+        <w:rPr>
+          <w:rFonts w:ascii="Times New Roman" w:hAnsi="Times New Roman" w:cs="Times New Roman"/>
+        </w:rPr>
+      </w:pPr>
+    </w:p>
+    <w:p>
+      <w:pPr>
+        <w:spacing w:line="360" w:lineRule="auto"/>
+        <w:jc w:val="both"/>
+        <w:rPr>
+          <w:rFonts w:ascii="Times New Roman" w:hAnsi="Times New Roman" w:cs="Times New Roman"/>
+        </w:rPr>
+      </w:pPr>
+    </w:p>
+    <w:p>
+      <w:pPr>
+        <w:spacing w:line="360" w:lineRule="auto"/>
+        <w:jc w:val="both"/>
+        <w:rPr>
+          <w:rFonts w:ascii="Times New Roman" w:hAnsi="Times New Roman" w:cs="Times New Roman"/>
+        </w:rPr>
+      </w:pPr>
+    </w:p>
+    <w:p>
+      <w:pPr>
+        <w:spacing w:line="360" w:lineRule="auto"/>
+        <w:jc w:val="both"/>
+        <w:rPr>
+          <w:rFonts w:ascii="Times New Roman" w:hAnsi="Times New Roman" w:cs="Times New Roman"/>
+        </w:rPr>
+      </w:pPr>
+      <w:r>
         <w:rPr>
           <w:rFonts w:ascii="Times New Roman" w:hAnsi="Times New Roman" w:cs="Times New Roman"/>
           <w:b/>
@@ -880,342 +1530,13 @@
           <w:sz w:val="32"/>
           <w:szCs w:val="32"/>
         </w:rPr>
-      </w:pPr>
-    </w:p>
-    <w:p>
-      <w:pPr>
-        <w:rPr>
-          <w:rFonts w:ascii="Times New Roman" w:hAnsi="Times New Roman" w:cs="Times New Roman"/>
-          <w:b/>
-          <w:bCs/>
-          <w:sz w:val="32"/>
-          <w:szCs w:val="32"/>
-        </w:rPr>
-      </w:pPr>
-    </w:p>
-    <w:p>
-      <w:pPr>
-        <w:rPr>
-          <w:rFonts w:ascii="Times New Roman" w:hAnsi="Times New Roman" w:cs="Times New Roman"/>
-          <w:b/>
-          <w:bCs/>
-          <w:sz w:val="32"/>
-          <w:szCs w:val="32"/>
-        </w:rPr>
-      </w:pPr>
-    </w:p>
-    <w:p>
-      <w:pPr>
-        <w:rPr>
-          <w:rFonts w:ascii="Times New Roman" w:hAnsi="Times New Roman" w:cs="Times New Roman"/>
-          <w:b/>
-          <w:bCs/>
-          <w:sz w:val="32"/>
-          <w:szCs w:val="32"/>
-        </w:rPr>
-      </w:pPr>
-    </w:p>
-    <w:p>
-      <w:pPr>
-        <w:rPr>
-          <w:rFonts w:ascii="Times New Roman" w:hAnsi="Times New Roman" w:cs="Times New Roman"/>
-          <w:b/>
-          <w:bCs/>
-          <w:sz w:val="32"/>
-          <w:szCs w:val="32"/>
-        </w:rPr>
-      </w:pPr>
-    </w:p>
-    <w:p>
-      <w:pPr>
-        <w:rPr>
-          <w:rFonts w:ascii="Times New Roman" w:hAnsi="Times New Roman" w:cs="Times New Roman"/>
-          <w:b/>
-          <w:bCs/>
-          <w:sz w:val="32"/>
-          <w:szCs w:val="32"/>
-        </w:rPr>
-      </w:pPr>
-    </w:p>
-    <w:p>
-      <w:pPr>
-        <w:rPr>
-          <w:rFonts w:ascii="Times New Roman" w:hAnsi="Times New Roman" w:cs="Times New Roman"/>
-          <w:b/>
-          <w:bCs/>
-          <w:sz w:val="32"/>
-          <w:szCs w:val="32"/>
-        </w:rPr>
-      </w:pPr>
-    </w:p>
-    <w:p>
-      <w:pPr>
-        <w:rPr>
-          <w:rFonts w:ascii="Times New Roman" w:hAnsi="Times New Roman" w:cs="Times New Roman"/>
-          <w:b/>
-          <w:bCs/>
-          <w:sz w:val="32"/>
-          <w:szCs w:val="32"/>
-        </w:rPr>
-      </w:pPr>
-      <w:r>
-        <w:rPr>
-          <w:rFonts w:ascii="Times New Roman" w:hAnsi="Times New Roman" w:cs="Times New Roman"/>
-          <w:b/>
-          <w:bCs/>
-          <w:sz w:val="32"/>
-          <w:szCs w:val="32"/>
-        </w:rPr>
         <w:lastRenderedPageBreak/>
-        <w:t>INTRODUÇÃO</w:t>
-      </w:r>
-    </w:p>
-    <w:p>
-      <w:pPr>
-        <w:jc w:val="both"/>
-        <w:rPr>
-          <w:rFonts w:ascii="Times New Roman" w:hAnsi="Times New Roman" w:cs="Times New Roman"/>
-        </w:rPr>
-      </w:pPr>
-      <w:r>
-        <w:rPr>
-          <w:rFonts w:ascii="Times New Roman" w:hAnsi="Times New Roman" w:cs="Times New Roman"/>
-        </w:rPr>
-        <w:t xml:space="preserve">O crescimento do parque </w:t>
-      </w:r>
-      <w:r>
-        <w:rPr>
-          <w:rFonts w:ascii="Times New Roman" w:hAnsi="Times New Roman" w:cs="Times New Roman"/>
-        </w:rPr>
-        <w:t xml:space="preserve">de </w:t>
-      </w:r>
-      <w:r>
-        <w:rPr>
-          <w:rFonts w:ascii="Times New Roman" w:hAnsi="Times New Roman" w:cs="Times New Roman"/>
-        </w:rPr>
-        <w:t>automóvel nas grandes cidades aumenta o congestionamento nas horas de ponta, o consumo de combustível e o tempo perdido pelos cidadãos nas deslocações diárias. A maioria dos semáforos em funcionamento utiliza ciclos de tempo fixos, que não respondem às variações reais do tráfego ao longo do dia.</w:t>
-      </w:r>
-    </w:p>
-    <w:p>
-      <w:pPr>
-        <w:jc w:val="both"/>
-        <w:rPr>
-          <w:rFonts w:ascii="Times New Roman" w:hAnsi="Times New Roman" w:cs="Times New Roman"/>
-        </w:rPr>
-      </w:pPr>
-      <w:r>
-        <w:rPr>
-          <w:rFonts w:ascii="Times New Roman" w:hAnsi="Times New Roman" w:cs="Times New Roman"/>
-        </w:rPr>
-        <w:t>Os sistemas de controlo semafórico adaptativo, como o SCOOT e o SCATS, resolvem parte deste problema, mas exigem infra-estruturas dispendiosas e complexas. Existe, por isso, espaço para soluções de baixo custo, baseadas em microcontroladores e Internet das Coisas (IoT), adequadas a realidades como a de Luanda, onde o trânsito é intenso e a energia eléctrica nem sempre é estável.</w:t>
-      </w:r>
-    </w:p>
-    <w:p>
-      <w:pPr>
-        <w:jc w:val="both"/>
-        <w:rPr>
-          <w:rFonts w:ascii="Times New Roman" w:hAnsi="Times New Roman" w:cs="Times New Roman"/>
-        </w:rPr>
-      </w:pPr>
-      <w:r>
-        <w:rPr>
-          <w:rFonts w:ascii="Times New Roman" w:hAnsi="Times New Roman" w:cs="Times New Roman"/>
-        </w:rPr>
-        <w:t>A presente proposta descreve o desenvolvimento de um protótipo de semáforo inteligente que ajusta o tempo de verde em função da densidade de veículos, acompanhado de um painel web de monitorização e de dados históricos.</w:t>
-      </w:r>
-    </w:p>
-    <w:p>
-      <w:pPr>
-        <w:jc w:val="both"/>
-        <w:rPr>
-          <w:rFonts w:ascii="Times New Roman" w:hAnsi="Times New Roman" w:cs="Times New Roman"/>
-        </w:rPr>
-      </w:pPr>
-    </w:p>
-    <w:p>
-      <w:pPr>
-        <w:rPr>
-          <w:rFonts w:ascii="Times New Roman" w:hAnsi="Times New Roman" w:cs="Times New Roman"/>
-        </w:rPr>
-      </w:pPr>
-      <w:r>
-        <w:rPr>
-          <w:rFonts w:ascii="Times New Roman" w:hAnsi="Times New Roman" w:cs="Times New Roman"/>
-        </w:rPr>
-        <w:br w:type="page"/>
-      </w:r>
-    </w:p>
-    <w:p>
-      <w:pPr>
-        <w:jc w:val="both"/>
-        <w:rPr>
-          <w:rFonts w:ascii="Times New Roman" w:hAnsi="Times New Roman" w:cs="Times New Roman"/>
-          <w:b/>
-          <w:bCs/>
-          <w:sz w:val="32"/>
-          <w:szCs w:val="32"/>
-        </w:rPr>
-      </w:pPr>
-      <w:r>
-        <w:rPr>
-          <w:rFonts w:ascii="Times New Roman" w:hAnsi="Times New Roman" w:cs="Times New Roman"/>
-          <w:b/>
-          <w:bCs/>
-          <w:sz w:val="32"/>
-          <w:szCs w:val="32"/>
-        </w:rPr>
-        <w:lastRenderedPageBreak/>
-        <w:t>JUSTIFICATIVA</w:t>
-      </w:r>
-    </w:p>
-    <w:p>
-      <w:pPr>
-        <w:numPr>
-          <w:ilvl w:val="0"/>
-          <w:numId w:val="1"/>
-        </w:numPr>
-        <w:jc w:val="both"/>
-        <w:rPr>
-          <w:rFonts w:ascii="Times New Roman" w:hAnsi="Times New Roman" w:cs="Times New Roman"/>
-        </w:rPr>
-      </w:pPr>
-      <w:r>
-        <w:rPr>
-          <w:rFonts w:ascii="Times New Roman" w:hAnsi="Times New Roman" w:cs="Times New Roman"/>
-        </w:rPr>
-        <w:t>Reduzir o tempo de espera e o congestionamento nos cruzamentos.</w:t>
-      </w:r>
-    </w:p>
-    <w:p>
-      <w:pPr>
-        <w:numPr>
-          <w:ilvl w:val="0"/>
-          <w:numId w:val="1"/>
-        </w:numPr>
-        <w:jc w:val="both"/>
-        <w:rPr>
-          <w:rFonts w:ascii="Times New Roman" w:hAnsi="Times New Roman" w:cs="Times New Roman"/>
-        </w:rPr>
-      </w:pPr>
-      <w:r>
-        <w:rPr>
-          <w:rFonts w:ascii="Times New Roman" w:hAnsi="Times New Roman" w:cs="Times New Roman"/>
-        </w:rPr>
-        <w:t>Demonstrar uma solução de baixo custo, escalável e adaptada ao contexto local.</w:t>
-      </w:r>
-    </w:p>
-    <w:p>
-      <w:pPr>
-        <w:numPr>
-          <w:ilvl w:val="0"/>
-          <w:numId w:val="1"/>
-        </w:numPr>
-        <w:jc w:val="both"/>
-        <w:rPr>
-          <w:rFonts w:ascii="Times New Roman" w:hAnsi="Times New Roman" w:cs="Times New Roman"/>
-        </w:rPr>
-      </w:pPr>
-      <w:r>
-        <w:rPr>
-          <w:rFonts w:ascii="Times New Roman" w:hAnsi="Times New Roman" w:cs="Times New Roman"/>
-        </w:rPr>
-        <w:t>Integrar conhecimentos de electrónica, redes e desenvolvimento de software.</w:t>
-      </w:r>
-    </w:p>
-    <w:p>
-      <w:pPr>
-        <w:numPr>
-          <w:ilvl w:val="0"/>
-          <w:numId w:val="1"/>
-        </w:numPr>
-        <w:jc w:val="both"/>
-        <w:rPr>
-          <w:rFonts w:ascii="Times New Roman" w:hAnsi="Times New Roman" w:cs="Times New Roman"/>
-        </w:rPr>
-      </w:pPr>
-      <w:r>
-        <w:rPr>
-          <w:rFonts w:ascii="Times New Roman" w:hAnsi="Times New Roman" w:cs="Times New Roman"/>
-        </w:rPr>
-        <w:t>Gerar dados que possam apoiar o planeamento urbano e a tomada de decisão.</w:t>
-      </w:r>
-    </w:p>
-    <w:p>
-      <w:pPr>
-        <w:jc w:val="both"/>
-        <w:rPr>
-          <w:rFonts w:ascii="Times New Roman" w:hAnsi="Times New Roman" w:cs="Times New Roman"/>
-        </w:rPr>
-      </w:pPr>
-    </w:p>
-    <w:p>
-      <w:pPr>
-        <w:jc w:val="both"/>
-        <w:rPr>
-          <w:rFonts w:ascii="Times New Roman" w:hAnsi="Times New Roman" w:cs="Times New Roman"/>
-          <w:b/>
-          <w:bCs/>
-          <w:sz w:val="32"/>
-          <w:szCs w:val="32"/>
-        </w:rPr>
-      </w:pPr>
-      <w:r>
-        <w:rPr>
-          <w:rFonts w:ascii="Times New Roman" w:hAnsi="Times New Roman" w:cs="Times New Roman"/>
-          <w:b/>
-          <w:bCs/>
-          <w:sz w:val="32"/>
-          <w:szCs w:val="32"/>
-        </w:rPr>
-        <w:t>FORMULAÇÃO DO PROBLEMA</w:t>
-      </w:r>
-    </w:p>
-    <w:p>
-      <w:pPr>
-        <w:jc w:val="both"/>
-        <w:rPr>
-          <w:rFonts w:ascii="Times New Roman" w:hAnsi="Times New Roman" w:cs="Times New Roman"/>
-        </w:rPr>
-      </w:pPr>
-      <w:r>
-        <w:rPr>
-          <w:rFonts w:ascii="Times New Roman" w:hAnsi="Times New Roman" w:cs="Times New Roman"/>
-        </w:rPr>
-        <w:t>Os semáforos de ciclo fixo atribuem o mesmo tempo de verde a cada via, independentemente do número de veículos em espera. Isto gera filas desnecessárias em algumas vias e tempo de verde desperdiçado noutras. Além disso, não existe monitorização remota nem registo de dados que apoie o planeamento do tráfego.</w:t>
-      </w:r>
-    </w:p>
-    <w:p>
-      <w:pPr>
-        <w:jc w:val="both"/>
-        <w:rPr>
-          <w:rFonts w:ascii="Times New Roman" w:hAnsi="Times New Roman" w:cs="Times New Roman"/>
-        </w:rPr>
-      </w:pPr>
-    </w:p>
-    <w:p>
-      <w:pPr>
-        <w:jc w:val="both"/>
-        <w:rPr>
-          <w:rFonts w:ascii="Times New Roman" w:hAnsi="Times New Roman" w:cs="Times New Roman"/>
-          <w:b/>
-          <w:bCs/>
-          <w:sz w:val="32"/>
-          <w:szCs w:val="32"/>
-        </w:rPr>
-      </w:pPr>
-      <w:r>
-        <w:rPr>
-          <w:rFonts w:ascii="Times New Roman" w:hAnsi="Times New Roman" w:cs="Times New Roman"/>
-          <w:b/>
-          <w:bCs/>
-          <w:sz w:val="32"/>
-          <w:szCs w:val="32"/>
-        </w:rPr>
         <w:t>OBJECTIVOS</w:t>
       </w:r>
     </w:p>
     <w:p>
       <w:pPr>
+        <w:spacing w:line="360" w:lineRule="auto"/>
         <w:jc w:val="both"/>
         <w:rPr>
           <w:rFonts w:ascii="Times New Roman" w:hAnsi="Times New Roman" w:cs="Times New Roman"/>
@@ -1243,6 +1564,7 @@
           <w:ilvl w:val="0"/>
           <w:numId w:val="4"/>
         </w:numPr>
+        <w:spacing w:line="360" w:lineRule="auto"/>
         <w:jc w:val="both"/>
         <w:rPr>
           <w:rFonts w:ascii="Times New Roman" w:hAnsi="Times New Roman" w:cs="Times New Roman"/>
@@ -1257,14 +1579,16 @@
     </w:p>
     <w:p>
       <w:pPr>
-        <w:jc w:val="both"/>
-        <w:rPr>
-          <w:rFonts w:ascii="Times New Roman" w:hAnsi="Times New Roman" w:cs="Times New Roman"/>
-        </w:rPr>
-      </w:pPr>
-    </w:p>
-    <w:p>
-      <w:pPr>
+        <w:spacing w:line="360" w:lineRule="auto"/>
+        <w:jc w:val="both"/>
+        <w:rPr>
+          <w:rFonts w:ascii="Times New Roman" w:hAnsi="Times New Roman" w:cs="Times New Roman"/>
+        </w:rPr>
+      </w:pPr>
+    </w:p>
+    <w:p>
+      <w:pPr>
+        <w:spacing w:line="360" w:lineRule="auto"/>
         <w:jc w:val="both"/>
         <w:rPr>
           <w:rFonts w:ascii="Times New Roman" w:hAnsi="Times New Roman" w:cs="Times New Roman"/>
@@ -1292,6 +1616,8 @@
           <w:ilvl w:val="0"/>
           <w:numId w:val="4"/>
         </w:numPr>
+        <w:spacing w:line="360" w:lineRule="auto"/>
+        <w:jc w:val="both"/>
         <w:rPr>
           <w:rFonts w:ascii="Times New Roman" w:hAnsi="Times New Roman" w:cs="Times New Roman"/>
         </w:rPr>
@@ -1310,6 +1636,8 @@
           <w:ilvl w:val="0"/>
           <w:numId w:val="4"/>
         </w:numPr>
+        <w:spacing w:line="360" w:lineRule="auto"/>
+        <w:jc w:val="both"/>
         <w:rPr>
           <w:rFonts w:ascii="Times New Roman" w:hAnsi="Times New Roman" w:cs="Times New Roman"/>
         </w:rPr>
@@ -1328,6 +1656,8 @@
           <w:ilvl w:val="0"/>
           <w:numId w:val="4"/>
         </w:numPr>
+        <w:spacing w:line="360" w:lineRule="auto"/>
+        <w:jc w:val="both"/>
         <w:rPr>
           <w:rFonts w:ascii="Times New Roman" w:hAnsi="Times New Roman" w:cs="Times New Roman"/>
         </w:rPr>
@@ -1346,6 +1676,8 @@
           <w:ilvl w:val="0"/>
           <w:numId w:val="4"/>
         </w:numPr>
+        <w:spacing w:line="360" w:lineRule="auto"/>
+        <w:jc w:val="both"/>
         <w:rPr>
           <w:rFonts w:ascii="Times New Roman" w:hAnsi="Times New Roman" w:cs="Times New Roman"/>
         </w:rPr>
@@ -1364,6 +1696,8 @@
           <w:ilvl w:val="0"/>
           <w:numId w:val="4"/>
         </w:numPr>
+        <w:spacing w:line="360" w:lineRule="auto"/>
+        <w:jc w:val="both"/>
         <w:rPr>
           <w:rFonts w:ascii="Times New Roman" w:hAnsi="Times New Roman" w:cs="Times New Roman"/>
         </w:rPr>
@@ -1377,13 +1711,15 @@
     </w:p>
     <w:p>
       <w:pPr>
-        <w:rPr>
-          <w:rFonts w:ascii="Times New Roman" w:hAnsi="Times New Roman" w:cs="Times New Roman"/>
-        </w:rPr>
-      </w:pPr>
-    </w:p>
-    <w:p>
-      <w:pPr>
+        <w:spacing w:line="360" w:lineRule="auto"/>
+        <w:rPr>
+          <w:rFonts w:ascii="Times New Roman" w:hAnsi="Times New Roman" w:cs="Times New Roman"/>
+        </w:rPr>
+      </w:pPr>
+    </w:p>
+    <w:p>
+      <w:pPr>
+        <w:spacing w:line="360" w:lineRule="auto"/>
         <w:rPr>
           <w:rFonts w:ascii="Times New Roman" w:hAnsi="Times New Roman" w:cs="Times New Roman"/>
           <w:b/>
@@ -1402,20 +1738,7 @@
         </w:rPr>
         <w:t>HIPÓTESE</w:t>
       </w:r>
-    </w:p>
-    <w:p>
-      <w:pPr>
-        <w:rPr>
-          <w:rFonts w:ascii="Times New Roman" w:hAnsi="Times New Roman" w:cs="Times New Roman"/>
-          <w:b/>
-          <w:bCs/>
-          <w:sz w:val="36"/>
-          <w:szCs w:val="36"/>
-        </w:rPr>
-      </w:pPr>
-    </w:p>
-    <w:p>
-      <w:pPr>
+      <w:r>
         <w:rPr>
           <w:rFonts w:ascii="Times New Roman" w:hAnsi="Times New Roman" w:cs="Times New Roman"/>
           <w:b/>
@@ -1423,8 +1746,190 @@
           <w:sz w:val="32"/>
           <w:szCs w:val="32"/>
         </w:rPr>
-      </w:pPr>
-      <w:r>
+        <w:t>S</w:t>
+      </w:r>
+    </w:p>
+    <w:p>
+      <w:pPr>
+        <w:spacing w:line="360" w:lineRule="auto"/>
+        <w:jc w:val="both"/>
+        <w:rPr>
+          <w:rFonts w:ascii="Times New Roman" w:hAnsi="Times New Roman" w:cs="Times New Roman"/>
+        </w:rPr>
+      </w:pPr>
+      <w:r>
+        <w:rPr>
+          <w:rFonts w:ascii="Times New Roman" w:hAnsi="Times New Roman" w:cs="Times New Roman"/>
+        </w:rPr>
+        <w:t>A hipótese fundamenta-se na ideia de que a adaptação dos tempos semafóricos à procura real das vias pode diminuir atrasos e filas, enquanto a monitorização remota permite acompanhar o estado do sistema e intervir com maior rapidez. Estudos e trabalhos semelhantes relacionam o controlo semafórico adaptativo com a redução do atraso veicular e destacam a importância do controlo e monitorização remotos.</w:t>
+      </w:r>
+    </w:p>
+    <w:p>
+      <w:pPr>
+        <w:jc w:val="both"/>
+        <w:rPr>
+          <w:rFonts w:ascii="Times New Roman" w:hAnsi="Times New Roman" w:cs="Times New Roman"/>
+        </w:rPr>
+      </w:pPr>
+    </w:p>
+    <w:p>
+      <w:pPr>
+        <w:pStyle w:val="PargrafodaLista"/>
+        <w:numPr>
+          <w:ilvl w:val="0"/>
+          <w:numId w:val="6"/>
+        </w:numPr>
+        <w:spacing w:line="360" w:lineRule="auto"/>
+        <w:jc w:val="both"/>
+        <w:rPr>
+          <w:rFonts w:ascii="Times New Roman" w:hAnsi="Times New Roman" w:cs="Times New Roman"/>
+        </w:rPr>
+      </w:pPr>
+      <w:r>
+        <w:rPr>
+          <w:rFonts w:ascii="Times New Roman" w:hAnsi="Times New Roman" w:cs="Times New Roman"/>
+        </w:rPr>
+        <w:t xml:space="preserve">H1: A utilização de sensores para recolher dados sobre o fluxo e a densidade de veículos permitirá ajustar dinamicamente os tempos de sinal verde, amarelo e vermelho. </w:t>
+      </w:r>
+    </w:p>
+    <w:p>
+      <w:pPr>
+        <w:spacing w:line="360" w:lineRule="auto"/>
+        <w:jc w:val="both"/>
+        <w:rPr>
+          <w:rFonts w:ascii="Times New Roman" w:hAnsi="Times New Roman" w:cs="Times New Roman"/>
+        </w:rPr>
+      </w:pPr>
+    </w:p>
+    <w:p>
+      <w:pPr>
+        <w:pStyle w:val="PargrafodaLista"/>
+        <w:numPr>
+          <w:ilvl w:val="0"/>
+          <w:numId w:val="6"/>
+        </w:numPr>
+        <w:spacing w:line="360" w:lineRule="auto"/>
+        <w:jc w:val="both"/>
+        <w:rPr>
+          <w:rFonts w:ascii="Times New Roman" w:hAnsi="Times New Roman" w:cs="Times New Roman"/>
+        </w:rPr>
+      </w:pPr>
+      <w:r>
+        <w:rPr>
+          <w:rFonts w:ascii="Times New Roman" w:hAnsi="Times New Roman" w:cs="Times New Roman"/>
+        </w:rPr>
+        <w:t xml:space="preserve">H2: O sistema adaptativo reduzirá o tempo médio de espera dos veículos nas interseções, em comparação com o funcionamento de semáforos de temporização fixa. </w:t>
+      </w:r>
+    </w:p>
+    <w:p>
+      <w:pPr>
+        <w:spacing w:line="360" w:lineRule="auto"/>
+        <w:jc w:val="both"/>
+        <w:rPr>
+          <w:rFonts w:ascii="Times New Roman" w:hAnsi="Times New Roman" w:cs="Times New Roman"/>
+        </w:rPr>
+      </w:pPr>
+    </w:p>
+    <w:p>
+      <w:pPr>
+        <w:pStyle w:val="PargrafodaLista"/>
+        <w:spacing w:line="360" w:lineRule="auto"/>
+        <w:rPr>
+          <w:rFonts w:ascii="Times New Roman" w:hAnsi="Times New Roman" w:cs="Times New Roman"/>
+        </w:rPr>
+      </w:pPr>
+    </w:p>
+    <w:p>
+      <w:pPr>
+        <w:pStyle w:val="PargrafodaLista"/>
+        <w:numPr>
+          <w:ilvl w:val="0"/>
+          <w:numId w:val="6"/>
+        </w:numPr>
+        <w:spacing w:line="360" w:lineRule="auto"/>
+        <w:jc w:val="both"/>
+        <w:rPr>
+          <w:rFonts w:ascii="Times New Roman" w:hAnsi="Times New Roman" w:cs="Times New Roman"/>
+        </w:rPr>
+      </w:pPr>
+      <w:r>
+        <w:rPr>
+          <w:rFonts w:ascii="Times New Roman" w:hAnsi="Times New Roman" w:cs="Times New Roman"/>
+        </w:rPr>
+        <w:lastRenderedPageBreak/>
+        <w:t>H3: A aplicação de uma plataforma web permitirá monitorizar, em tempo real, o estado dos semáforos, o fluxo de veículos e possíveis ocorrências no sistema.</w:t>
+      </w:r>
+    </w:p>
+    <w:p>
+      <w:pPr>
+        <w:spacing w:line="360" w:lineRule="auto"/>
+        <w:ind w:left="360"/>
+        <w:jc w:val="both"/>
+        <w:rPr>
+          <w:rFonts w:ascii="Times New Roman" w:hAnsi="Times New Roman" w:cs="Times New Roman"/>
+        </w:rPr>
+      </w:pPr>
+    </w:p>
+    <w:p>
+      <w:pPr>
+        <w:pStyle w:val="PargrafodaLista"/>
+        <w:numPr>
+          <w:ilvl w:val="0"/>
+          <w:numId w:val="6"/>
+        </w:numPr>
+        <w:spacing w:line="360" w:lineRule="auto"/>
+        <w:jc w:val="both"/>
+        <w:rPr>
+          <w:rFonts w:ascii="Times New Roman" w:hAnsi="Times New Roman" w:cs="Times New Roman"/>
+        </w:rPr>
+      </w:pPr>
+      <w:r>
+        <w:rPr>
+          <w:rFonts w:ascii="Times New Roman" w:hAnsi="Times New Roman" w:cs="Times New Roman"/>
+        </w:rPr>
+        <w:t xml:space="preserve">H4: A disponibilização de dados históricos e indicadores de tráfego na plataforma web facilitará a análise do desempenho das vias e apoiará a tomada de decisões pelos responsáveis pela gestão do tráfego. </w:t>
+      </w:r>
+    </w:p>
+    <w:p>
+      <w:pPr>
+        <w:spacing w:line="360" w:lineRule="auto"/>
+        <w:jc w:val="both"/>
+        <w:rPr>
+          <w:rFonts w:ascii="Times New Roman" w:hAnsi="Times New Roman" w:cs="Times New Roman"/>
+        </w:rPr>
+      </w:pPr>
+    </w:p>
+    <w:p>
+      <w:pPr>
+        <w:pStyle w:val="PargrafodaLista"/>
+        <w:numPr>
+          <w:ilvl w:val="0"/>
+          <w:numId w:val="6"/>
+        </w:numPr>
+        <w:spacing w:line="360" w:lineRule="auto"/>
+        <w:jc w:val="both"/>
+        <w:rPr>
+          <w:rFonts w:ascii="Times New Roman" w:hAnsi="Times New Roman" w:cs="Times New Roman"/>
+        </w:rPr>
+      </w:pPr>
+      <w:r>
+        <w:rPr>
+          <w:rFonts w:ascii="Times New Roman" w:hAnsi="Times New Roman" w:cs="Times New Roman"/>
+        </w:rPr>
+        <w:t>H5: A utilização conjunta de controlo adaptativo e monitorização web contribuirá para melhorar a fluidez do tráfego e reduzir a formação de filas nas interseções analisadas.</w:t>
+      </w:r>
+    </w:p>
+    <w:p>
+      <w:pPr>
+        <w:jc w:val="both"/>
+        <w:rPr>
+          <w:rFonts w:ascii="Times New Roman" w:hAnsi="Times New Roman" w:cs="Times New Roman"/>
+        </w:rPr>
+      </w:pPr>
+    </w:p>
+    <w:p>
+      <w:pPr>
+        <w:spacing w:line="360" w:lineRule="auto"/>
         <w:rPr>
           <w:rFonts w:ascii="Times New Roman" w:hAnsi="Times New Roman" w:cs="Times New Roman"/>
           <w:b/>
@@ -1432,12 +1937,80 @@
           <w:sz w:val="32"/>
           <w:szCs w:val="32"/>
         </w:rPr>
+      </w:pPr>
+      <w:r>
+        <w:rPr>
+          <w:rFonts w:ascii="Times New Roman" w:hAnsi="Times New Roman" w:cs="Times New Roman"/>
+          <w:b/>
+          <w:bCs/>
+          <w:sz w:val="32"/>
+          <w:szCs w:val="32"/>
+        </w:rPr>
         <w:t>DELIMITAÇÃO</w:t>
       </w:r>
     </w:p>
+    <w:p>
+      <w:pPr>
+        <w:spacing w:line="360" w:lineRule="auto"/>
+        <w:jc w:val="both"/>
+        <w:rPr>
+          <w:rFonts w:ascii="Times New Roman" w:hAnsi="Times New Roman" w:cs="Times New Roman"/>
+          <w:b/>
+          <w:bCs/>
+          <w:sz w:val="32"/>
+          <w:szCs w:val="32"/>
+        </w:rPr>
+      </w:pPr>
+      <w:r>
+        <w:rPr>
+          <w:rFonts w:ascii="Times New Roman" w:hAnsi="Times New Roman" w:cs="Times New Roman"/>
+          <w:lang w:val="pt-PT"/>
+        </w:rPr>
+        <w:t xml:space="preserve">O presente trabalho como o </w:t>
+      </w:r>
+      <w:r>
+        <w:rPr>
+          <w:rFonts w:ascii="Times New Roman" w:hAnsi="Times New Roman" w:cs="Times New Roman"/>
+          <w:lang w:val="pt-PT"/>
+        </w:rPr>
+        <w:t>tema</w:t>
+      </w:r>
+      <w:r>
+        <w:rPr>
+          <w:rFonts w:ascii="Times New Roman" w:hAnsi="Times New Roman" w:cs="Times New Roman"/>
+          <w:lang w:val="pt-PT"/>
+        </w:rPr>
+        <w:t xml:space="preserve"> </w:t>
+      </w:r>
+      <w:r>
+        <w:rPr>
+          <w:rFonts w:ascii="Times New Roman" w:hAnsi="Times New Roman" w:cs="Times New Roman"/>
+        </w:rPr>
+        <w:t>Desenvolvimento de um Sistema de Semáforo Inteligente Adaptativo com Monitorização Web para a Gestão de Tráfego Urbano</w:t>
+      </w:r>
+      <w:r>
+        <w:rPr>
+          <w:rFonts w:ascii="Times New Roman" w:hAnsi="Times New Roman" w:cs="Times New Roman"/>
+          <w:b/>
+          <w:bCs/>
+          <w:sz w:val="32"/>
+          <w:szCs w:val="32"/>
+        </w:rPr>
+        <w:t xml:space="preserve"> </w:t>
+      </w:r>
+      <w:r>
+        <w:rPr>
+          <w:rFonts w:ascii="Times New Roman" w:hAnsi="Times New Roman" w:cs="Times New Roman"/>
+          <w:lang w:val="pt-PT"/>
+        </w:rPr>
+        <w:t>está delimitado ao bairro Camama?</w:t>
+      </w:r>
+    </w:p>
     <w:sectPr>
+      <w:footerReference w:type="default" r:id="rId8"/>
       <w:pgSz w:w="11906" w:h="16838"/>
-      <w:pgMar w:top="1417" w:right="1701" w:bottom="1417" w:left="1701" w:header="708" w:footer="708" w:gutter="0"/>
+      <w:pgMar w:top="851" w:right="1134" w:bottom="851" w:left="1418" w:header="708" w:footer="708" w:gutter="0"/>
+      <w:pgNumType w:start="1"/>
       <w:cols w:space="708"/>
       <w:docGrid w:linePitch="360"/>
     </w:sectPr>
@@ -1468,6 +2041,51 @@
     </w:p>
   </w:endnote>
 </w:endnotes>
+</file>
+
+<file path=word/footer1.xml><?xml version="1.0" encoding="utf-8"?>
+<w:ftr xmlns:wpc="http://schemas.microsoft.com/office/word/2010/wordprocessingCanvas" xmlns:cx="http://schemas.microsoft.com/office/drawing/2014/chartex" xmlns:cx1="http://schemas.microsoft.com/office/drawing/2015/9/8/chartex" xmlns:cx2="http://schemas.microsoft.com/office/drawing/2015/10/21/chartex" xmlns:cx3="http://schemas.microsoft.com/office/drawing/2016/5/9/chartex" xmlns:cx4="http://schemas.microsoft.com/office/drawing/2016/5/10/chartex" xmlns:cx5="http://schemas.microsoft.com/office/drawing/2016/5/11/chartex" xmlns:cx6="http://schemas.microsoft.com/office/drawing/2016/5/12/chartex" xmlns:cx7="http://schemas.microsoft.com/office/drawing/2016/5/13/chartex" xmlns:cx8="http://schemas.microsoft.com/office/drawing/2016/5/14/chartex" xmlns:mc="http://schemas.openxmlformats.org/markup-compatibility/2006" xmlns:aink="http://schemas.microsoft.com/office/drawing/2016/ink" xmlns:am3d="http://schemas.microsoft.com/office/drawing/2017/model3d" xmlns:o="urn:schemas-microsoft-com:office:office" xmlns:oel="http://schemas.microsoft.com/office/2019/extlst" xmlns:r="http://schemas.openxmlformats.org/officeDocument/2006/relationships" xmlns:m="http://schemas.openxmlformats.org/officeDocument/2006/math" xmlns:v="urn:schemas-microsoft-com:vml" xmlns:wp14="http://schemas.microsoft.com/office/word/2010/wordprocessingDrawing" xmlns:wp="http://schemas.openxmlformats.org/drawingml/2006/wordprocessingDrawing" xmlns:w10="urn:schemas-microsoft-com:office:word" xmlns:w="http://schemas.openxmlformats.org/wordprocessingml/2006/main" xmlns:w14="http://schemas.microsoft.com/office/word/2010/wordml" xmlns:w15="http://schemas.microsoft.com/office/word/2012/wordml" xmlns:w16cex="http://schemas.microsoft.com/office/word/2018/wordml/cex" xmlns:w16cid="http://schemas.microsoft.com/office/word/2016/wordml/cid" xmlns:w16="http://schemas.microsoft.com/office/word/2018/wordml" xmlns:w16du="http://schemas.microsoft.com/office/word/2023/wordml/word16du" xmlns:w16sdtdh="http://schemas.microsoft.com/office/word/2020/wordml/sdtdatahash" xmlns:w16sdtfl="http://schemas.microsoft.com/office/word/2024/wordml/sdtformatlock" xmlns:w16se="http://schemas.microsoft.com/office/word/2015/wordml/symex" xmlns:wpg="http://schemas.microsoft.com/office/word/2010/wordprocessingGroup" xmlns:wpi="http://schemas.microsoft.com/office/word/2010/wordprocessingInk" xmlns:wne="http://schemas.microsoft.com/office/word/2006/wordml" xmlns:wps="http://schemas.microsoft.com/office/word/2010/wordprocessingShape" mc:Ignorable="w14 w15 w16se w16cid w16 w16cex w16sdtdh w16sdtfl w16du wp14">
+  <w:sdt>
+    <w:sdtPr>
+      <w:id w:val="809834173"/>
+      <w:docPartObj>
+        <w:docPartGallery w:val="Page Numbers (Bottom of Page)"/>
+        <w:docPartUnique/>
+      </w:docPartObj>
+    </w:sdtPr>
+    <w:sdtContent>
+      <w:p>
+        <w:pPr>
+          <w:pStyle w:val="Rodap"/>
+          <w:jc w:val="center"/>
+        </w:pPr>
+        <w:r>
+          <w:fldChar w:fldCharType="begin"/>
+        </w:r>
+        <w:r>
+          <w:instrText>PAGE   \* MERGEFORMAT</w:instrText>
+        </w:r>
+        <w:r>
+          <w:fldChar w:fldCharType="separate"/>
+        </w:r>
+        <w:r>
+          <w:rPr>
+            <w:lang w:val="pt-BR"/>
+          </w:rPr>
+          <w:t>2</w:t>
+        </w:r>
+        <w:r>
+          <w:fldChar w:fldCharType="end"/>
+        </w:r>
+      </w:p>
+    </w:sdtContent>
+  </w:sdt>
+  <w:p>
+    <w:pPr>
+      <w:pStyle w:val="Rodap"/>
+    </w:pPr>
+  </w:p>
+</w:ftr>
 </file>
 
 <file path=word/footnotes.xml><?xml version="1.0" encoding="utf-8"?>
@@ -1802,6 +2420,119 @@
     </w:lvl>
   </w:abstractNum>
   <w:abstractNum w:abstractNumId="3" w15:restartNumberingAfterBreak="0">
+    <w:nsid w:val="257A7987"/>
+    <w:multiLevelType w:val="hybridMultilevel"/>
+    <w:tmpl w:val="F014B5C8"/>
+    <w:lvl w:ilvl="0" w:tplc="0C000001">
+      <w:start w:val="1"/>
+      <w:numFmt w:val="bullet"/>
+      <w:lvlText w:val=""/>
+      <w:lvlJc w:val="left"/>
+      <w:pPr>
+        <w:ind w:left="720" w:hanging="360"/>
+      </w:pPr>
+      <w:rPr>
+        <w:rFonts w:ascii="Symbol" w:hAnsi="Symbol" w:hint="default"/>
+      </w:rPr>
+    </w:lvl>
+    <w:lvl w:ilvl="1" w:tplc="0C000003" w:tentative="1">
+      <w:start w:val="1"/>
+      <w:numFmt w:val="bullet"/>
+      <w:lvlText w:val="o"/>
+      <w:lvlJc w:val="left"/>
+      <w:pPr>
+        <w:ind w:left="1440" w:hanging="360"/>
+      </w:pPr>
+      <w:rPr>
+        <w:rFonts w:ascii="Courier New" w:hAnsi="Courier New" w:cs="Courier New" w:hint="default"/>
+      </w:rPr>
+    </w:lvl>
+    <w:lvl w:ilvl="2" w:tplc="0C000005" w:tentative="1">
+      <w:start w:val="1"/>
+      <w:numFmt w:val="bullet"/>
+      <w:lvlText w:val=""/>
+      <w:lvlJc w:val="left"/>
+      <w:pPr>
+        <w:ind w:left="2160" w:hanging="360"/>
+      </w:pPr>
+      <w:rPr>
+        <w:rFonts w:ascii="Wingdings" w:hAnsi="Wingdings" w:hint="default"/>
+      </w:rPr>
+    </w:lvl>
+    <w:lvl w:ilvl="3" w:tplc="0C000001" w:tentative="1">
+      <w:start w:val="1"/>
+      <w:numFmt w:val="bullet"/>
+      <w:lvlText w:val=""/>
+      <w:lvlJc w:val="left"/>
+      <w:pPr>
+        <w:ind w:left="2880" w:hanging="360"/>
+      </w:pPr>
+      <w:rPr>
+        <w:rFonts w:ascii="Symbol" w:hAnsi="Symbol" w:hint="default"/>
+      </w:rPr>
+    </w:lvl>
+    <w:lvl w:ilvl="4" w:tplc="0C000003" w:tentative="1">
+      <w:start w:val="1"/>
+      <w:numFmt w:val="bullet"/>
+      <w:lvlText w:val="o"/>
+      <w:lvlJc w:val="left"/>
+      <w:pPr>
+        <w:ind w:left="3600" w:hanging="360"/>
+      </w:pPr>
+      <w:rPr>
+        <w:rFonts w:ascii="Courier New" w:hAnsi="Courier New" w:cs="Courier New" w:hint="default"/>
+      </w:rPr>
+    </w:lvl>
+    <w:lvl w:ilvl="5" w:tplc="0C000005" w:tentative="1">
+      <w:start w:val="1"/>
+      <w:numFmt w:val="bullet"/>
+      <w:lvlText w:val=""/>
+      <w:lvlJc w:val="left"/>
+      <w:pPr>
+        <w:ind w:left="4320" w:hanging="360"/>
+      </w:pPr>
+      <w:rPr>
+        <w:rFonts w:ascii="Wingdings" w:hAnsi="Wingdings" w:hint="default"/>
+      </w:rPr>
+    </w:lvl>
+    <w:lvl w:ilvl="6" w:tplc="0C000001" w:tentative="1">
+      <w:start w:val="1"/>
+      <w:numFmt w:val="bullet"/>
+      <w:lvlText w:val=""/>
+      <w:lvlJc w:val="left"/>
+      <w:pPr>
+        <w:ind w:left="5040" w:hanging="360"/>
+      </w:pPr>
+      <w:rPr>
+        <w:rFonts w:ascii="Symbol" w:hAnsi="Symbol" w:hint="default"/>
+      </w:rPr>
+    </w:lvl>
+    <w:lvl w:ilvl="7" w:tplc="0C000003" w:tentative="1">
+      <w:start w:val="1"/>
+      <w:numFmt w:val="bullet"/>
+      <w:lvlText w:val="o"/>
+      <w:lvlJc w:val="left"/>
+      <w:pPr>
+        <w:ind w:left="5760" w:hanging="360"/>
+      </w:pPr>
+      <w:rPr>
+        <w:rFonts w:ascii="Courier New" w:hAnsi="Courier New" w:cs="Courier New" w:hint="default"/>
+      </w:rPr>
+    </w:lvl>
+    <w:lvl w:ilvl="8" w:tplc="0C000005" w:tentative="1">
+      <w:start w:val="1"/>
+      <w:numFmt w:val="bullet"/>
+      <w:lvlText w:val=""/>
+      <w:lvlJc w:val="left"/>
+      <w:pPr>
+        <w:ind w:left="6480" w:hanging="360"/>
+      </w:pPr>
+      <w:rPr>
+        <w:rFonts w:ascii="Wingdings" w:hAnsi="Wingdings" w:hint="default"/>
+      </w:rPr>
+    </w:lvl>
+  </w:abstractNum>
+  <w:abstractNum w:abstractNumId="4" w15:restartNumberingAfterBreak="0">
     <w:nsid w:val="4F0E1BFE"/>
     <w:multiLevelType w:val="hybridMultilevel"/>
     <w:tmpl w:val="4B94000C"/>
@@ -1914,7 +2645,7 @@
       </w:rPr>
     </w:lvl>
   </w:abstractNum>
-  <w:abstractNum w:abstractNumId="4" w15:restartNumberingAfterBreak="0">
+  <w:abstractNum w:abstractNumId="5" w15:restartNumberingAfterBreak="0">
     <w:nsid w:val="5A437AE6"/>
     <w:multiLevelType w:val="hybridMultilevel"/>
     <w:tmpl w:val="3C88AE02"/>
@@ -1996,7 +2727,7 @@
     <w:abstractNumId w:val="2"/>
   </w:num>
   <w:num w:numId="2" w16cid:durableId="198516496">
-    <w:abstractNumId w:val="3"/>
+    <w:abstractNumId w:val="4"/>
   </w:num>
   <w:num w:numId="3" w16cid:durableId="1334145835">
     <w:abstractNumId w:val="1"/>
@@ -2005,7 +2736,7 @@
     <w:abstractNumId w:val="0"/>
   </w:num>
   <w:num w:numId="5" w16cid:durableId="611791618">
-    <w:abstractNumId w:val="4"/>
+    <w:abstractNumId w:val="5"/>
     <w:lvlOverride w:ilvl="0">
       <w:startOverride w:val="1"/>
     </w:lvlOverride>
@@ -2017,6 +2748,9 @@
     <w:lvlOverride w:ilvl="6"/>
     <w:lvlOverride w:ilvl="7"/>
     <w:lvlOverride w:ilvl="8"/>
+  </w:num>
+  <w:num w:numId="6" w16cid:durableId="2062093730">
+    <w:abstractNumId w:val="3"/>
   </w:num>
 </w:numbering>
 </file>
@@ -2421,7 +3155,7 @@
   <w:style w:type="paragraph" w:default="1" w:styleId="Normal">
     <w:name w:val="Normal"/>
     <w:qFormat/>
-    <w:rsid w:val="00CB0B42"/>
+    <w:rsid w:val="00CA0009"/>
   </w:style>
   <w:style w:type="paragraph" w:styleId="Ttulo1">
     <w:name w:val="heading 1"/>

</xml_diff>